<commit_message>
Reword Hansard link-rot example in abstract and b.1
URLs "cited in ministerial answers to Parliamentary Questions" instead
of URLs ministers "gave" Parliament.

Co-Authored-By: Claude Opus 5.5 <noreply@anthropic.com>
</commit_message>
<xml_diff>
--- a/draft/B1.docx
+++ b/draft/B1.docx
@@ -121,7 +121,25 @@
         <w:jc w:val="both"/>
       </w:pPr>
       <w:r>
-        <w:t xml:space="preserve">The World Wide Web scaled to billions of users because of architectural decisions that gave up stable references, versioning, and bidirectional links. The downsides of this trade-off show today, when information conveyance has societal consequences: a fabricated audio clip of a party leader circulated, unverifiable, during Slovakia’s 2023 pre-election silence; over half the URLs UK ministers gave Parliament in 1997–2006 no longer resolved by 2007; courts in Europe and beyond have received over 1,200 filings with AI-fabricated citations; and copyright courts in Munich and New York must reconstruct attribution trails the Web never recorded. The Web’s architecture deferred, rather than avoided, the cost of coordination, and society now pays it.</w:t>
+        <w:t xml:space="preserve">The World Wide Web scaled to billions of users because of architectural decisions that gave up stable references, versioning, and bidirectional links. The downsides of this trade-off show today, when information conveyance has societal consequences: a fabricated audio clip of a party leader circulated, unverifiable, during Slovakia’s 2023 pre-election silence; over half the URLs </w:t>
+      </w:r>
+      <w:r>
+        <w:rPr>
+          <w:highlight w:val="yellow"/>
+        </w:rPr>
+        <w:t xml:space="preserve">in</w:t>
+      </w:r>
+      <w:r>
+        <w:t xml:space="preserve"> UK </w:t>
+      </w:r>
+      <w:r>
+        <w:rPr>
+          <w:highlight w:val="yellow"/>
+        </w:rPr>
+        <w:t xml:space="preserve">parliamentary answers of</w:t>
+      </w:r>
+      <w:r>
+        <w:t xml:space="preserve"> 1997–2006 no longer resolved by 2007; courts in Europe and beyond have received over 1,200 filings with AI-fabricated citations; and copyright courts in Munich and New York must reconstruct attribution trails the Web never recorded. The Web’s architecture deferred, rather than avoided, the cost of coordination, and society now pays it.</w:t>
       </w:r>
     </w:p>
     <w:p>
@@ -320,7 +338,25 @@
         <w:jc w:val="both"/>
       </w:pPr>
       <w:r>
-        <w:t xml:space="preserve">Society pays for these omissions: In 2007 the UK government found that more than half of the roughly 4,000 URLs ministers had given in answers to Parliamentary Questions since 1997 no longer resolved, and built a redirect service into its national Web archive in response [22]; one in five scholarly articles cites Web content that has since rotted [23]. Two days before Slovakia's 2023 election, a fabricated recording of a party leader discussing vote-rigging circulated with no provenance that voters could check [24]. From February 2027, batteries sold in the EU (and, soon after, products from clothes to detergents) must carry a digital passport with carbon-footprint and due-diligence data assembled from suppliers along the chain [25]. Law shows the cost most sharply, because there a reference's stability is part of the claim it supports. The EU has given judgments and legislation persistent identifiers through ELI [26, 27], but these name documents, not cited passages or versions; half the URLs cited in U.S. Supreme Court opinions no longer resolve, and Perma.cc archives cited pages one citation at a time [28]. By early 2026, more than 1,200 court decisions worldwide concerned AI-fabricated citations [29], and the High Court of England and Wales warned that citing fabricated authorities may lead to referral to the regulator or to contempt proceedings [30]. Content provenance is being moved into camera hardware [31] and into EU law [32, 11], and the Munich Regional Court held in November 2025 that a language model's memorization of song lyrics infringes copyright [33], a similar question to what </w:t>
+        <w:t xml:space="preserve">Society pays for these omissions: In 2007 the UK government found that more than half of the roughly 4,000 URLs </w:t>
+      </w:r>
+      <w:r>
+        <w:rPr>
+          <w:highlight w:val="yellow"/>
+        </w:rPr>
+        <w:t xml:space="preserve">cited</w:t>
+      </w:r>
+      <w:r>
+        <w:t xml:space="preserve"> in </w:t>
+      </w:r>
+      <w:r>
+        <w:rPr>
+          <w:highlight w:val="yellow"/>
+        </w:rPr>
+        <w:t xml:space="preserve">ministerial</w:t>
+      </w:r>
+      <w:r>
+        <w:t xml:space="preserve"> answers to Parliamentary Questions since 1997 no longer resolved, and built a redirect service into its national Web archive in response [22]; one in five scholarly articles cites Web content that has since rotted [23]. Two days before Slovakia's 2023 election, a fabricated recording of a party leader discussing vote-rigging circulated with no provenance that voters could check [24]. From February 2027, batteries sold in the EU (and, soon after, products from clothes to detergents) must carry a digital passport with carbon-footprint and due-diligence data assembled from suppliers along the chain [25]. Law shows the cost most sharply, because there a reference's stability is part of the claim it supports. The EU has given judgments and legislation persistent identifiers through ELI [26, 27], but these name documents, not cited passages or versions; half the URLs cited in U.S. Supreme Court opinions no longer resolve, and Perma.cc archives cited pages one citation at a time [28]. By early 2026, more than 1,200 court decisions worldwide concerned AI-fabricated citations [29], and the High Court of England and Wales warned that citing fabricated authorities may lead to referral to the regulator or to contempt proceedings [30]. Content provenance is being moved into camera hardware [31] and into EU law [32, 11], and the Munich Regional Court held in November 2025 that a language model's memorization of song lyrics infringes copyright [33], a similar question to what </w:t>
       </w:r>
       <w:r>
         <w:rPr>

</xml_diff>